<commit_message>
Figures 4 and S3 laid out like Figure 2 (lag windows as columns); Figure 2 legend dropped; interaction sensitivities extended
- Table S7b adds: weather 0-7 d with birds 7-28 d (null - the effect needs the
  second week), and drop-one refits showing the opposite-signed precipitation
  and runoff terms are independent (within-stratum r = 0.12; each unchanged
  without the other).
- Brief: Figure 4 read explains the rain-vs-snowmelt interpretation and the
  collinearity check.
</commit_message>
<xml_diff>
--- a/04_tables/main/TableS7b_interaction_robust.docx
+++ b/04_tables/main/TableS7b_interaction_robust.docx
@@ -2654,7 +2654,7 @@
                 <w:szCs w:val="14"/>
                 <w:color w:val="000000"/>
               </w:rPr>
-              <w:t xml:space="preserve">Bird window: 85</w:t>
+              <w:t xml:space="preserve">85</w:t>
             </w:r>
           </w:p>
         </w:tc>
@@ -2920,7 +2920,7 @@
                 <w:szCs w:val="14"/>
                 <w:color w:val="000000"/>
               </w:rPr>
-              <w:t xml:space="preserve">Bird window: 175</w:t>
+              <w:t xml:space="preserve">175</w:t>
             </w:r>
           </w:p>
         </w:tc>
@@ -5048,7 +5048,7 @@
                 <w:szCs w:val="14"/>
                 <w:color w:val="000000"/>
               </w:rPr>
-              <w:t xml:space="preserve">Bird window: 85</w:t>
+              <w:t xml:space="preserve">85</w:t>
             </w:r>
           </w:p>
         </w:tc>
@@ -5314,7 +5314,7 @@
                 <w:szCs w:val="14"/>
                 <w:color w:val="000000"/>
               </w:rPr>
-              <w:t xml:space="preserve">Bird window: 175</w:t>
+              <w:t xml:space="preserve">175</w:t>
             </w:r>
           </w:p>
         </w:tc>
@@ -7442,7 +7442,7 @@
                 <w:szCs w:val="14"/>
                 <w:color w:val="000000"/>
               </w:rPr>
-              <w:t xml:space="preserve">Bird window: 85</w:t>
+              <w:t xml:space="preserve">85</w:t>
             </w:r>
           </w:p>
         </w:tc>
@@ -7708,7 +7708,7 @@
                 <w:szCs w:val="14"/>
                 <w:color w:val="000000"/>
               </w:rPr>
-              <w:t xml:space="preserve">Bird window: 175</w:t>
+              <w:t xml:space="preserve">175</w:t>
             </w:r>
           </w:p>
         </w:tc>
@@ -9836,7 +9836,7 @@
                 <w:szCs w:val="14"/>
                 <w:color w:val="000000"/>
               </w:rPr>
-              <w:t xml:space="preserve">Bird window: 85</w:t>
+              <w:t xml:space="preserve">85</w:t>
             </w:r>
           </w:p>
         </w:tc>
@@ -10102,7 +10102,7 @@
                 <w:szCs w:val="14"/>
                 <w:color w:val="000000"/>
               </w:rPr>
-              <w:t xml:space="preserve">Bird window: 175</w:t>
+              <w:t xml:space="preserve">175</w:t>
             </w:r>
           </w:p>
         </w:tc>
@@ -12230,7 +12230,7 @@
                 <w:szCs w:val="14"/>
                 <w:color w:val="000000"/>
               </w:rPr>
-              <w:t xml:space="preserve">Bird window: 85</w:t>
+              <w:t xml:space="preserve">85</w:t>
             </w:r>
           </w:p>
         </w:tc>
@@ -12496,7 +12496,7 @@
                 <w:szCs w:val="14"/>
                 <w:color w:val="000000"/>
               </w:rPr>
-              <w:t xml:space="preserve">Bird window: 175</w:t>
+              <w:t xml:space="preserve">175</w:t>
             </w:r>
           </w:p>
         </w:tc>
@@ -14890,7 +14890,7 @@
                 <w:szCs w:val="14"/>
                 <w:color w:val="000000"/>
               </w:rPr>
-              <w:t xml:space="preserve">Bird window: 85</w:t>
+              <w:t xml:space="preserve">85</w:t>
             </w:r>
           </w:p>
         </w:tc>
@@ -15156,7 +15156,7 @@
                 <w:szCs w:val="14"/>
                 <w:color w:val="000000"/>
               </w:rPr>
-              <w:t xml:space="preserve">Bird window: 175</w:t>
+              <w:t xml:space="preserve">175</w:t>
             </w:r>
           </w:p>
         </w:tc>
@@ -17284,7 +17284,7 @@
                 <w:szCs w:val="14"/>
                 <w:color w:val="000000"/>
               </w:rPr>
-              <w:t xml:space="preserve">Bird window: 85</w:t>
+              <w:t xml:space="preserve">85</w:t>
             </w:r>
           </w:p>
         </w:tc>
@@ -17550,7 +17550,7 @@
                 <w:szCs w:val="14"/>
                 <w:color w:val="000000"/>
               </w:rPr>
-              <w:t xml:space="preserve">Bird window: 175</w:t>
+              <w:t xml:space="preserve">175</w:t>
             </w:r>
           </w:p>
         </w:tc>
@@ -19678,7 +19678,7 @@
                 <w:szCs w:val="14"/>
                 <w:color w:val="000000"/>
               </w:rPr>
-              <w:t xml:space="preserve">Bird window: 85</w:t>
+              <w:t xml:space="preserve">85</w:t>
             </w:r>
           </w:p>
         </w:tc>
@@ -19944,7 +19944,7 @@
                 <w:szCs w:val="14"/>
                 <w:color w:val="000000"/>
               </w:rPr>
-              <w:t xml:space="preserve">Bird window: 175</w:t>
+              <w:t xml:space="preserve">175</w:t>
             </w:r>
           </w:p>
         </w:tc>
@@ -22072,7 +22072,7 @@
                 <w:szCs w:val="14"/>
                 <w:color w:val="000000"/>
               </w:rPr>
-              <w:t xml:space="preserve">Bird window: 85</w:t>
+              <w:t xml:space="preserve">85</w:t>
             </w:r>
           </w:p>
         </w:tc>
@@ -22338,7 +22338,7 @@
                 <w:szCs w:val="14"/>
                 <w:color w:val="000000"/>
               </w:rPr>
-              <w:t xml:space="preserve">Bird window: 175</w:t>
+              <w:t xml:space="preserve">175</w:t>
             </w:r>
           </w:p>
         </w:tc>
@@ -24466,7 +24466,7 @@
                 <w:szCs w:val="14"/>
                 <w:color w:val="000000"/>
               </w:rPr>
-              <w:t xml:space="preserve">Bird window: 85</w:t>
+              <w:t xml:space="preserve">85</w:t>
             </w:r>
           </w:p>
         </w:tc>
@@ -24732,7 +24732,7 @@
                 <w:szCs w:val="14"/>
                 <w:color w:val="000000"/>
               </w:rPr>
-              <w:t xml:space="preserve">Bird window: 175</w:t>
+              <w:t xml:space="preserve">175</w:t>
             </w:r>
           </w:p>
         </w:tc>
@@ -24999,7 +24999,7 @@
                 <w:szCs w:val="14"/>
                 <w:color w:val="000000"/>
               </w:rPr>
-              <w:t xml:space="preserve">Ratio of the meteorological effect at high versus low prior waterfowl, under alternative specifications. Lag basis: the smooth ns(2) used in the exploratory fit, an unsmoothed strata basis with a break at day 8, and ns(3). Modifier: waterfowl dichotomised at the stratum median, at the outer tertiles, or entered continuously. Bird window: the lag range over which waterfowl abundance is averaged to form the modifier. The reported model (Table S7a) uses the strata basis, the continuous modifier and the 15-28 day window.</w:t>
+              <w:t xml:space="preserve">Ratio of the meteorological effect at high versus low prior waterfowl, under alternative specifications. Lag basis: the smooth ns(2) used in the exploratory fit, an unsmoothed strata basis with a break at day 8, and ns(3). Modifier: waterfowl dichotomised at the stratum median, at the outer tertiles, or entered continuously. Bird window: the lag range over which waterfowl abundance is averaged to form the modifier; the 0-7 day variant restricts the weather term to the first week. Drop-one rows refit the model without the other water term. A dash marks a window the variant does not estimate. The reported model (Table S7a) uses the strata basis, the continuous modifier and the 15-28 day window.</w:t>
             </w:r>
           </w:p>
         </w:tc>

</xml_diff>